<commit_message>
Chot ke hoach moi, them agent, them dang nhap
</commit_message>
<xml_diff>
--- a/docs/day-06-huong-dan-trien-khai-vps.docx
+++ b/docs/day-06-huong-dan-trien-khai-vps.docx
@@ -335,7 +335,563 @@
         <w:spacing w:after="120"/>
       </w:pPr>
       <w:r>
-        <w:t xml:space="preserve">Cấu hình tối thiểu nên thuê, dựa trên giới hạn cpus/mem_limit đã khai báo trong docker-compose.yaml (postgres 512 MB, mongo 1 GB, minio 1 GB, web 512 MB) cộng Caddy (~256 MB) và hệ điều hành:</w:t>
+        <w:t xml:space="preserve">Đây là đồ án môn, không phải hệ thống production thật — không cần VPS mạnh. Các gói VPS Cheap của BKNS (tham khảo, giá có thể thay đổi):</w:t>
+      </w:r>
+    </w:p>
+    <w:tbl>
+      <w:tblPr>
+        <w:tblW w:type="dxa" w:w="9100"/>
+        <w:tblBorders>
+          <w:top w:val="single" w:color="auto" w:sz="4"/>
+          <w:left w:val="single" w:color="auto" w:sz="4"/>
+          <w:bottom w:val="single" w:color="auto" w:sz="4"/>
+          <w:right w:val="single" w:color="auto" w:sz="4"/>
+          <w:insideH w:val="single" w:color="auto" w:sz="4"/>
+          <w:insideV w:val="single" w:color="auto" w:sz="4"/>
+        </w:tblBorders>
+      </w:tblPr>
+      <w:tblGrid>
+        <w:gridCol w:w="2200"/>
+        <w:gridCol w:w="1400"/>
+        <w:gridCol w:w="1400"/>
+        <w:gridCol w:w="1300"/>
+        <w:gridCol w:w="1400"/>
+        <w:gridCol w:w="1400"/>
+      </w:tblGrid>
+      <w:tr>
+        <w:tc>
+          <w:tcPr>
+            <w:tcW w:type="dxa" w:w="2200"/>
+            <w:shd w:fill="E6ECE8" w:val="clear"/>
+          </w:tcPr>
+          <w:p>
+            <w:r>
+              <w:rPr>
+                <w:b/>
+                <w:bCs/>
+              </w:rPr>
+              <w:t xml:space="preserve">Gói</w:t>
+            </w:r>
+          </w:p>
+        </w:tc>
+        <w:tc>
+          <w:tcPr>
+            <w:tcW w:type="dxa" w:w="1400"/>
+            <w:shd w:fill="E6ECE8" w:val="clear"/>
+          </w:tcPr>
+          <w:p>
+            <w:r>
+              <w:rPr>
+                <w:b/>
+                <w:bCs/>
+              </w:rPr>
+              <w:t xml:space="preserve">Giá/tháng</w:t>
+            </w:r>
+          </w:p>
+        </w:tc>
+        <w:tc>
+          <w:tcPr>
+            <w:tcW w:type="dxa" w:w="1400"/>
+            <w:shd w:fill="E6ECE8" w:val="clear"/>
+          </w:tcPr>
+          <w:p>
+            <w:r>
+              <w:rPr>
+                <w:b/>
+                <w:bCs/>
+              </w:rPr>
+              <w:t xml:space="preserve">RAM</w:t>
+            </w:r>
+          </w:p>
+        </w:tc>
+        <w:tc>
+          <w:tcPr>
+            <w:tcW w:type="dxa" w:w="1300"/>
+            <w:shd w:fill="E6ECE8" w:val="clear"/>
+          </w:tcPr>
+          <w:p>
+            <w:r>
+              <w:rPr>
+                <w:b/>
+                <w:bCs/>
+              </w:rPr>
+              <w:t xml:space="preserve">CPU</w:t>
+            </w:r>
+          </w:p>
+        </w:tc>
+        <w:tc>
+          <w:tcPr>
+            <w:tcW w:type="dxa" w:w="1400"/>
+            <w:shd w:fill="E6ECE8" w:val="clear"/>
+          </w:tcPr>
+          <w:p>
+            <w:r>
+              <w:rPr>
+                <w:b/>
+                <w:bCs/>
+              </w:rPr>
+              <w:t xml:space="preserve">Ổ cứng</w:t>
+            </w:r>
+          </w:p>
+        </w:tc>
+        <w:tc>
+          <w:tcPr>
+            <w:tcW w:type="dxa" w:w="1400"/>
+            <w:shd w:fill="E6ECE8" w:val="clear"/>
+          </w:tcPr>
+          <w:p>
+            <w:r>
+              <w:rPr>
+                <w:b/>
+                <w:bCs/>
+              </w:rPr>
+              <w:t xml:space="preserve">Băng thông</w:t>
+            </w:r>
+          </w:p>
+        </w:tc>
+      </w:tr>
+      <w:tr>
+        <w:tc>
+          <w:tcPr>
+            <w:tcW w:type="dxa" w:w="2200"/>
+          </w:tcPr>
+          <w:p>
+            <w:r>
+              <w:rPr>
+                <w:b w:val="false"/>
+                <w:bCs w:val="false"/>
+              </w:rPr>
+              <w:t xml:space="preserve">Cheap 1</w:t>
+            </w:r>
+          </w:p>
+        </w:tc>
+        <w:tc>
+          <w:tcPr>
+            <w:tcW w:type="dxa" w:w="1400"/>
+          </w:tcPr>
+          <w:p>
+            <w:r>
+              <w:rPr>
+                <w:b w:val="false"/>
+                <w:bCs w:val="false"/>
+              </w:rPr>
+              <w:t xml:space="preserve">70.000đ</w:t>
+            </w:r>
+          </w:p>
+        </w:tc>
+        <w:tc>
+          <w:tcPr>
+            <w:tcW w:type="dxa" w:w="1400"/>
+          </w:tcPr>
+          <w:p>
+            <w:r>
+              <w:rPr>
+                <w:b w:val="false"/>
+                <w:bCs w:val="false"/>
+              </w:rPr>
+              <w:t xml:space="preserve">1 GB</w:t>
+            </w:r>
+          </w:p>
+        </w:tc>
+        <w:tc>
+          <w:tcPr>
+            <w:tcW w:type="dxa" w:w="1300"/>
+          </w:tcPr>
+          <w:p>
+            <w:r>
+              <w:rPr>
+                <w:b w:val="false"/>
+                <w:bCs w:val="false"/>
+              </w:rPr>
+              <w:t xml:space="preserve">1 Core</w:t>
+            </w:r>
+          </w:p>
+        </w:tc>
+        <w:tc>
+          <w:tcPr>
+            <w:tcW w:type="dxa" w:w="1400"/>
+          </w:tcPr>
+          <w:p>
+            <w:r>
+              <w:rPr>
+                <w:b w:val="false"/>
+                <w:bCs w:val="false"/>
+              </w:rPr>
+              <w:t xml:space="preserve">20 GB</w:t>
+            </w:r>
+          </w:p>
+        </w:tc>
+        <w:tc>
+          <w:tcPr>
+            <w:tcW w:type="dxa" w:w="1400"/>
+          </w:tcPr>
+          <w:p>
+            <w:r>
+              <w:rPr>
+                <w:b w:val="false"/>
+                <w:bCs w:val="false"/>
+              </w:rPr>
+              <w:t xml:space="preserve">Không giới hạn</w:t>
+            </w:r>
+          </w:p>
+        </w:tc>
+      </w:tr>
+      <w:tr>
+        <w:tc>
+          <w:tcPr>
+            <w:tcW w:type="dxa" w:w="2200"/>
+          </w:tcPr>
+          <w:p>
+            <w:r>
+              <w:rPr>
+                <w:b w:val="false"/>
+                <w:bCs w:val="false"/>
+              </w:rPr>
+              <w:t xml:space="preserve">Cheap 2</w:t>
+            </w:r>
+          </w:p>
+        </w:tc>
+        <w:tc>
+          <w:tcPr>
+            <w:tcW w:type="dxa" w:w="1400"/>
+          </w:tcPr>
+          <w:p>
+            <w:r>
+              <w:rPr>
+                <w:b w:val="false"/>
+                <w:bCs w:val="false"/>
+              </w:rPr>
+              <w:t xml:space="preserve">95.000đ</w:t>
+            </w:r>
+          </w:p>
+        </w:tc>
+        <w:tc>
+          <w:tcPr>
+            <w:tcW w:type="dxa" w:w="1400"/>
+          </w:tcPr>
+          <w:p>
+            <w:r>
+              <w:rPr>
+                <w:b w:val="false"/>
+                <w:bCs w:val="false"/>
+              </w:rPr>
+              <w:t xml:space="preserve">2 GB</w:t>
+            </w:r>
+          </w:p>
+        </w:tc>
+        <w:tc>
+          <w:tcPr>
+            <w:tcW w:type="dxa" w:w="1300"/>
+          </w:tcPr>
+          <w:p>
+            <w:r>
+              <w:rPr>
+                <w:b w:val="false"/>
+                <w:bCs w:val="false"/>
+              </w:rPr>
+              <w:t xml:space="preserve">1 Core</w:t>
+            </w:r>
+          </w:p>
+        </w:tc>
+        <w:tc>
+          <w:tcPr>
+            <w:tcW w:type="dxa" w:w="1400"/>
+          </w:tcPr>
+          <w:p>
+            <w:r>
+              <w:rPr>
+                <w:b w:val="false"/>
+                <w:bCs w:val="false"/>
+              </w:rPr>
+              <w:t xml:space="preserve">25 GB</w:t>
+            </w:r>
+          </w:p>
+        </w:tc>
+        <w:tc>
+          <w:tcPr>
+            <w:tcW w:type="dxa" w:w="1400"/>
+          </w:tcPr>
+          <w:p>
+            <w:r>
+              <w:rPr>
+                <w:b w:val="false"/>
+                <w:bCs w:val="false"/>
+              </w:rPr>
+              <w:t xml:space="preserve">Không giới hạn</w:t>
+            </w:r>
+          </w:p>
+        </w:tc>
+      </w:tr>
+      <w:tr>
+        <w:tc>
+          <w:tcPr>
+            <w:tcW w:type="dxa" w:w="2200"/>
+          </w:tcPr>
+          <w:p>
+            <w:r>
+              <w:rPr>
+                <w:b w:val="false"/>
+                <w:bCs w:val="false"/>
+              </w:rPr>
+              <w:t xml:space="preserve">Cheap 3</w:t>
+            </w:r>
+          </w:p>
+        </w:tc>
+        <w:tc>
+          <w:tcPr>
+            <w:tcW w:type="dxa" w:w="1400"/>
+          </w:tcPr>
+          <w:p>
+            <w:r>
+              <w:rPr>
+                <w:b w:val="false"/>
+                <w:bCs w:val="false"/>
+              </w:rPr>
+              <w:t xml:space="preserve">110.000đ</w:t>
+            </w:r>
+          </w:p>
+        </w:tc>
+        <w:tc>
+          <w:tcPr>
+            <w:tcW w:type="dxa" w:w="1400"/>
+          </w:tcPr>
+          <w:p>
+            <w:r>
+              <w:rPr>
+                <w:b w:val="false"/>
+                <w:bCs w:val="false"/>
+              </w:rPr>
+              <w:t xml:space="preserve">2 GB</w:t>
+            </w:r>
+          </w:p>
+        </w:tc>
+        <w:tc>
+          <w:tcPr>
+            <w:tcW w:type="dxa" w:w="1300"/>
+          </w:tcPr>
+          <w:p>
+            <w:r>
+              <w:rPr>
+                <w:b w:val="false"/>
+                <w:bCs w:val="false"/>
+              </w:rPr>
+              <w:t xml:space="preserve">2 Core</w:t>
+            </w:r>
+          </w:p>
+        </w:tc>
+        <w:tc>
+          <w:tcPr>
+            <w:tcW w:type="dxa" w:w="1400"/>
+          </w:tcPr>
+          <w:p>
+            <w:r>
+              <w:rPr>
+                <w:b w:val="false"/>
+                <w:bCs w:val="false"/>
+              </w:rPr>
+              <w:t xml:space="preserve">30 GB</w:t>
+            </w:r>
+          </w:p>
+        </w:tc>
+        <w:tc>
+          <w:tcPr>
+            <w:tcW w:type="dxa" w:w="1400"/>
+          </w:tcPr>
+          <w:p>
+            <w:r>
+              <w:rPr>
+                <w:b w:val="false"/>
+                <w:bCs w:val="false"/>
+              </w:rPr>
+              <w:t xml:space="preserve">Không giới hạn</w:t>
+            </w:r>
+          </w:p>
+        </w:tc>
+      </w:tr>
+      <w:tr>
+        <w:tc>
+          <w:tcPr>
+            <w:tcW w:type="dxa" w:w="2200"/>
+          </w:tcPr>
+          <w:p>
+            <w:r>
+              <w:rPr>
+                <w:b w:val="false"/>
+                <w:bCs w:val="false"/>
+              </w:rPr>
+              <w:t xml:space="preserve">Cheap 4</w:t>
+            </w:r>
+          </w:p>
+        </w:tc>
+        <w:tc>
+          <w:tcPr>
+            <w:tcW w:type="dxa" w:w="1400"/>
+          </w:tcPr>
+          <w:p>
+            <w:r>
+              <w:rPr>
+                <w:b w:val="false"/>
+                <w:bCs w:val="false"/>
+              </w:rPr>
+              <w:t xml:space="preserve">150.000đ</w:t>
+            </w:r>
+          </w:p>
+        </w:tc>
+        <w:tc>
+          <w:tcPr>
+            <w:tcW w:type="dxa" w:w="1400"/>
+          </w:tcPr>
+          <w:p>
+            <w:r>
+              <w:rPr>
+                <w:b w:val="false"/>
+                <w:bCs w:val="false"/>
+              </w:rPr>
+              <w:t xml:space="preserve">4 GB</w:t>
+            </w:r>
+          </w:p>
+        </w:tc>
+        <w:tc>
+          <w:tcPr>
+            <w:tcW w:type="dxa" w:w="1300"/>
+          </w:tcPr>
+          <w:p>
+            <w:r>
+              <w:rPr>
+                <w:b w:val="false"/>
+                <w:bCs w:val="false"/>
+              </w:rPr>
+              <w:t xml:space="preserve">2 Core</w:t>
+            </w:r>
+          </w:p>
+        </w:tc>
+        <w:tc>
+          <w:tcPr>
+            <w:tcW w:type="dxa" w:w="1400"/>
+          </w:tcPr>
+          <w:p>
+            <w:r>
+              <w:rPr>
+                <w:b w:val="false"/>
+                <w:bCs w:val="false"/>
+              </w:rPr>
+              <w:t xml:space="preserve">40 GB</w:t>
+            </w:r>
+          </w:p>
+        </w:tc>
+        <w:tc>
+          <w:tcPr>
+            <w:tcW w:type="dxa" w:w="1400"/>
+          </w:tcPr>
+          <w:p>
+            <w:r>
+              <w:rPr>
+                <w:b w:val="false"/>
+                <w:bCs w:val="false"/>
+              </w:rPr>
+              <w:t xml:space="preserve">Không giới hạn</w:t>
+            </w:r>
+          </w:p>
+        </w:tc>
+      </w:tr>
+      <w:tr>
+        <w:tc>
+          <w:tcPr>
+            <w:tcW w:type="dxa" w:w="2200"/>
+          </w:tcPr>
+          <w:p>
+            <w:r>
+              <w:rPr>
+                <w:b w:val="false"/>
+                <w:bCs w:val="false"/>
+              </w:rPr>
+              <w:t xml:space="preserve">Cheap 5</w:t>
+            </w:r>
+          </w:p>
+        </w:tc>
+        <w:tc>
+          <w:tcPr>
+            <w:tcW w:type="dxa" w:w="1400"/>
+          </w:tcPr>
+          <w:p>
+            <w:r>
+              <w:rPr>
+                <w:b w:val="false"/>
+                <w:bCs w:val="false"/>
+              </w:rPr>
+              <w:t xml:space="preserve">190.000đ</w:t>
+            </w:r>
+          </w:p>
+        </w:tc>
+        <w:tc>
+          <w:tcPr>
+            <w:tcW w:type="dxa" w:w="1400"/>
+          </w:tcPr>
+          <w:p>
+            <w:r>
+              <w:rPr>
+                <w:b w:val="false"/>
+                <w:bCs w:val="false"/>
+              </w:rPr>
+              <w:t xml:space="preserve">4 GB</w:t>
+            </w:r>
+          </w:p>
+        </w:tc>
+        <w:tc>
+          <w:tcPr>
+            <w:tcW w:type="dxa" w:w="1300"/>
+          </w:tcPr>
+          <w:p>
+            <w:r>
+              <w:rPr>
+                <w:b w:val="false"/>
+                <w:bCs w:val="false"/>
+              </w:rPr>
+              <w:t xml:space="preserve">4 Core</w:t>
+            </w:r>
+          </w:p>
+        </w:tc>
+        <w:tc>
+          <w:tcPr>
+            <w:tcW w:type="dxa" w:w="1400"/>
+          </w:tcPr>
+          <w:p>
+            <w:r>
+              <w:rPr>
+                <w:b w:val="false"/>
+                <w:bCs w:val="false"/>
+              </w:rPr>
+              <w:t xml:space="preserve">50 GB</w:t>
+            </w:r>
+          </w:p>
+        </w:tc>
+        <w:tc>
+          <w:tcPr>
+            <w:tcW w:type="dxa" w:w="1400"/>
+          </w:tcPr>
+          <w:p>
+            <w:r>
+              <w:rPr>
+                <w:b w:val="false"/>
+                <w:bCs w:val="false"/>
+              </w:rPr>
+              <w:t xml:space="preserve">Không giới hạn</w:t>
+            </w:r>
+          </w:p>
+        </w:tc>
+      </w:tr>
+    </w:tbl>
+    <w:p>
+      <w:pPr>
+        <w:spacing w:after="160"/>
+      </w:pPr>
+    </w:p>
+    <w:p>
+      <w:pPr>
+        <w:spacing w:after="120"/>
+      </w:pPr>
+      <w:r>
+        <w:t xml:space="preserve">Stack chạy 5 container (postgres, mongo, minio, web, caddy). Giới hạn mem_limit khai báo trong docker-compose.yaml (postgres 512 MB, mongo 1 GB, minio 1 GB, web 512 MB, caddy ~256 MB — cộng lại ~3.3 GB) là TRẦN tối đa, không phải mức RAM thực sự dùng — với lượng truy cập demo/bảo vệ đồ án (vài request, không có tải đồng thời lớn), mỗi container thường chỉ dùng một phần nhỏ của trần đó.</w:t>
       </w:r>
     </w:p>
     <w:p>
@@ -348,7 +904,7 @@
         <w:spacing w:after="60"/>
       </w:pPr>
       <w:r>
-        <w:t xml:space="preserve">RAM: tối thiểu 4 GB (khuyến nghị) — tổng mem_limit các container đã ~3.3 GB, cần thêm cho OS/buffer.</w:t>
+        <w:t xml:space="preserve">Khuyến nghị: Cheap 3 (110.000đ/tháng, 2 GB, 2 core) — đủ chạy ổn định, có 2 core để 5 container không giành CPU khi build/khởi động.</w:t>
       </w:r>
     </w:p>
     <w:p>
@@ -361,7 +917,7 @@
         <w:spacing w:after="60"/>
       </w:pPr>
       <w:r>
-        <w:t xml:space="preserve">CPU: 2 vCPU trở lên.</w:t>
+        <w:t xml:space="preserve">Tiết kiệm hơn: Cheap 2 (95.000đ, 2 GB, 1 core) — vẫn chạy được, chỉ chậm hơn lúc docker compose build hoặc khi nhiều service khởi động cùng lúc.</w:t>
       </w:r>
     </w:p>
     <w:p>
@@ -374,7 +930,7 @@
         <w:spacing w:after="60"/>
       </w:pPr>
       <w:r>
-        <w:t xml:space="preserve">Disk: tối thiểu 40 GB SSD (dữ liệu demo + image Docker + log).</w:t>
+        <w:t xml:space="preserve">Không khuyến nghị Cheap 1 (1 GB) trừ khi thật sự cần rẻ nhất — 1 GB cho cả OS + 5 container là rất sát, nên thêm swap file (2 GB) làm lưới an toàn nếu chọn gói này, và đừng chạy đồng thời quá nhiều request khi demo.</w:t>
       </w:r>
     </w:p>
     <w:p>
@@ -392,23 +948,10 @@
     </w:p>
     <w:p>
       <w:pPr>
-        <w:pStyle w:val="ListParagraph"/>
-        <w:numPr>
-          <w:ilvl w:val="0"/>
-          <w:numId w:val="2"/>
-        </w:numPr>
-        <w:spacing w:after="60"/>
-      </w:pPr>
-      <w:r>
-        <w:t xml:space="preserve">Chọn nhà cung cấp có sẵn địa chỉ IPv4 tĩnh (bắt buộc để trỏ DNS).</w:t>
-      </w:r>
-    </w:p>
-    <w:p>
-      <w:pPr>
         <w:spacing w:after="120"/>
       </w:pPr>
       <w:r>
-        <w:t xml:space="preserve">Sau khi VPS được cấp: ghi lại địa chỉ IP, lưu private key SSH cẩn thận, không chia sẻ.</w:t>
+        <w:t xml:space="preserve">Sau khi VPS được cấp: ghi lại địa chỉ IP, lưu private key SSH cẩn thận, không chia sẻ. Đo lại RAM/CPU/disk thật sau khi chạy đủ luồng demo (bước 6.10) để biết gói đã chọn có đủ dư hay cần đổi gói.</w:t>
       </w:r>
     </w:p>
     <w:p>
@@ -638,7 +1181,7 @@
         <w:spacing w:after="120" w:before="260"/>
       </w:pPr>
       <w:r>
-        <w:t xml:space="preserve">6.5. Trỏ tên miền (DNS)</w:t>
+        <w:t xml:space="preserve">6.5. Mua domain giá rẻ và trỏ DNS</w:t>
       </w:r>
     </w:p>
     <w:p>
@@ -646,7 +1189,122 @@
         <w:spacing w:after="120"/>
       </w:pPr>
       <w:r>
-        <w:t xml:space="preserve">Tại nhà cung cấp domain, tạo bản ghi A trỏ về IP VPS:</w:t>
+        <w:t xml:space="preserve">Chỉ cần domain rẻ nhất để demo, không cần domain "đẹp" hay thương hiệu thật. BKNS có domain giá tham khảo khoảng 30.000đ/năm cho một số đuôi khuyến mãi (kiểm tra giá thật khi đặt, khuyến mãi có thể đổi theo thời điểm).</w:t>
+      </w:r>
+    </w:p>
+    <w:p>
+      <w:pPr>
+        <w:spacing w:after="80"/>
+      </w:pPr>
+      <w:r>
+        <w:rPr>
+          <w:b/>
+          <w:bCs/>
+        </w:rPr>
+        <w:t xml:space="preserve">Gợi ý tên miền (nếu muốn đặt tên gợi mở hơn "Research Document Workspace")</w:t>
+      </w:r>
+    </w:p>
+    <w:p>
+      <w:pPr>
+        <w:spacing w:after="120"/>
+      </w:pPr>
+      <w:r>
+        <w:t xml:space="preserve">Vài gợi ý ngắn, dễ nhớ, theo hướng "nơi lưu trữ tài liệu / hỗ trợ viết" — kiểm tra còn trống ở BKNS trước khi chốt:</w:t>
+      </w:r>
+    </w:p>
+    <w:p>
+      <w:pPr>
+        <w:pStyle w:val="ListParagraph"/>
+        <w:numPr>
+          <w:ilvl w:val="0"/>
+          <w:numId w:val="2"/>
+        </w:numPr>
+        <w:spacing w:after="60"/>
+      </w:pPr>
+      <w:r>
+        <w:t xml:space="preserve">tulieuviet.vn — "tư liệu Việt", trung tính, hợp cả tài liệu nghiên cứu và bản thảo.</w:t>
+      </w:r>
+    </w:p>
+    <w:p>
+      <w:pPr>
+        <w:pStyle w:val="ListParagraph"/>
+        <w:numPr>
+          <w:ilvl w:val="0"/>
+          <w:numId w:val="2"/>
+        </w:numPr>
+        <w:spacing w:after="60"/>
+      </w:pPr>
+      <w:r>
+        <w:t xml:space="preserve">kholuutru.vn — "kho lưu trữ", nhấn vào vai trò lưu trữ tài liệu.</w:t>
+      </w:r>
+    </w:p>
+    <w:p>
+      <w:pPr>
+        <w:pStyle w:val="ListParagraph"/>
+        <w:numPr>
+          <w:ilvl w:val="0"/>
+          <w:numId w:val="2"/>
+        </w:numPr>
+        <w:spacing w:after="60"/>
+      </w:pPr>
+      <w:r>
+        <w:t xml:space="preserve">banthaoso.vn — "bản thảo số", hợp nếu muốn nhấn hướng hỗ trợ viết/lưu bản thảo (novel, ghi chú).</w:t>
+      </w:r>
+    </w:p>
+    <w:p>
+      <w:pPr>
+        <w:pStyle w:val="ListParagraph"/>
+        <w:numPr>
+          <w:ilvl w:val="0"/>
+          <w:numId w:val="2"/>
+        </w:numPr>
+        <w:spacing w:after="60"/>
+      </w:pPr>
+      <w:r>
+        <w:t xml:space="preserve">vietluutru.vn — ghép "viết" + "lưu trữ", ngắn, dễ đọc.</w:t>
+      </w:r>
+    </w:p>
+    <w:p>
+      <w:pPr>
+        <w:pStyle w:val="ListParagraph"/>
+        <w:numPr>
+          <w:ilvl w:val="0"/>
+          <w:numId w:val="2"/>
+        </w:numPr>
+        <w:spacing w:after="60"/>
+      </w:pPr>
+      <w:r>
+        <w:t xml:space="preserve">tailieu247.vn — dễ nhớ, gợi "tài liệu mọi lúc".</w:t>
+      </w:r>
+    </w:p>
+    <w:p>
+      <w:pPr>
+        <w:spacing w:after="160"/>
+        <w:ind w:left="200"/>
+      </w:pPr>
+      <w:r>
+        <w:rPr>
+          <w:b/>
+          <w:bCs/>
+          <w:i/>
+          <w:iCs/>
+        </w:rPr>
+        <w:t xml:space="preserve">Lưu ý: </w:t>
+      </w:r>
+      <w:r>
+        <w:rPr>
+          <w:i/>
+          <w:iCs/>
+        </w:rPr>
+        <w:t xml:space="preserve">Đây chỉ là gợi ý đặt tên cho bản demo, không phải tên đã đăng ký hay đã kiểm tra khả dụng — tự tra trên BKNS trước khi mua. Đổi tên miền không cần đổi code: chỉ đổi biến DOMAIN trong .env rồi khởi động lại Caddy.</w:t>
+      </w:r>
+    </w:p>
+    <w:p>
+      <w:pPr>
+        <w:spacing w:after="120"/>
+      </w:pPr>
+      <w:r>
+        <w:t xml:space="preserve">Tại BKNS (hoặc nhà cung cấp domain đã mua), tạo bản ghi A trỏ về IP VPS:</w:t>
       </w:r>
     </w:p>
     <w:tbl>
@@ -846,7 +1504,7 @@
           <w:szCs w:val="19"/>
         </w:rPr>
         <w:br/>
-        <w:t xml:space="preserve">nano .env    # thay 3 mật khẩu + DOMAIN=your-domain.example.com thật</w:t>
+        <w:t xml:space="preserve">nano .env    # thay password Postgres/Mongo/MinIO, SESSION_SECRET, ADMIN_USERNAME/PASSWORD, DOMAIN — tất cả thành giá trị THẬT, không dùng lại giá trị demo local</w:t>
       </w:r>
     </w:p>
     <w:p>
@@ -954,7 +1612,7 @@
         <w:spacing w:after="120"/>
       </w:pPr>
       <w:r>
-        <w:t xml:space="preserve">Mở trình duyệt tới https://your-domain.example.com/ — icon ổ khóa phải xuất hiện, không có cảnh báo chứng chỉ.</w:t>
+        <w:t xml:space="preserve">Mở trình duyệt tới https://your-domain.example.com/ — icon ổ khóa phải xuất hiện, không có cảnh báo chứng chỉ, và trang phải chuyển tới /login (Ngày 6: mọi trang trừ /health/* đều yêu cầu đăng nhập) — đăng nhập bằng ADMIN_USERNAME/ADMIN_PASSWORD vừa đặt ở bước 6.6 để vào trang chủ.</w:t>
       </w:r>
     </w:p>
     <w:p>
@@ -1117,7 +1775,7 @@
           <w:sz w:val="19"/>
           <w:szCs w:val="19"/>
         </w:rPr>
-        <w:t xml:space="preserve">python deploy/external-smoke-test.py https://your-domain.example.com</w:t>
+        <w:t xml:space="preserve">python deploy/external-smoke-test.py https://your-domain.example.com --username admin</w:t>
       </w:r>
     </w:p>
     <w:p>
@@ -1125,7 +1783,7 @@
         <w:spacing w:after="120"/>
       </w:pPr>
       <w:r>
-        <w:t xml:space="preserve">Script tạo project + upload + download thật qua HTTPS công khai; một response HTTPS thành công đã tự chứng minh chứng chỉ hợp lệ (urllib từ chối chứng chỉ tự ký/hết hạn theo mặc định).</w:t>
+        <w:t xml:space="preserve">Script hỏi mật khẩu tại chỗ (không gõ mật khẩu vào dòng lệnh), đăng nhập, rồi tạo project + upload + download thật qua HTTPS công khai; một response HTTPS thành công đã tự chứng minh chứng chỉ hợp lệ (urllib từ chối chứng chỉ tự ký/hết hạn theo mặc định).</w:t>
       </w:r>
     </w:p>
     <w:p>
@@ -1231,7 +1889,7 @@
           <w:szCs w:val="19"/>
         </w:rPr>
         <w:br/>
-        <w:t xml:space="preserve">python deploy\external-smoke-test.py https://your-domain.example.com</w:t>
+        <w:t xml:space="preserve">python deploy\external-smoke-test.py https://your-domain.example.com --username admin</w:t>
       </w:r>
     </w:p>
     <w:p>
@@ -1468,7 +2126,7 @@
                 <w:b w:val="false"/>
                 <w:bCs w:val="false"/>
               </w:rPr>
-              <w:t xml:space="preserve">Mở trình duyệt tại domain thật (HTTPS) — chỉ ra ổ khóa, tạo project mới</w:t>
+              <w:t xml:space="preserve">Mở trình duyệt tại domain thật (HTTPS) — chỉ ra ổ khóa, đăng nhập, tạo project mới</w:t>
             </w:r>
           </w:p>
         </w:tc>
@@ -1779,7 +2437,7 @@
                 <w:b w:val="false"/>
                 <w:bCs w:val="false"/>
               </w:rPr>
-              <w:t xml:space="preserve">Vì sao chưa có đăng nhập?</w:t>
+              <w:t xml:space="preserve">Đăng nhập hoạt động thế nào?</w:t>
             </w:r>
           </w:p>
         </w:tc>
@@ -1793,7 +2451,37 @@
                 <w:b w:val="false"/>
                 <w:bCs w:val="false"/>
               </w:rPr>
-              <w:t xml:space="preserve">Ngoài phạm vi 7 ngày gốc; đã có kế hoạch cụ thể (docs/ke-hoach-nang-cap.md) — mật khẩu quản trị chung, cookie ký bằng HMAC, không cần thêm dependency.</w:t>
+              <w:t xml:space="preserve">Bảng users trong PostgreSQL, hai role user/admin. Mật khẩu băm bằng PBKDF2 (thư viện chuẩn, không thêm dependency); session là cookie tự ký bằng HMAC-SHA256, không lưu ở server. Quản trị viên tạo/khóa/đổi role tài khoản qua /admin/users, không có đăng ký công khai.</w:t>
+            </w:r>
+          </w:p>
+        </w:tc>
+      </w:tr>
+      <w:tr>
+        <w:tc>
+          <w:tcPr>
+            <w:tcW w:type="dxa" w:w="4200"/>
+          </w:tcPr>
+          <w:p>
+            <w:r>
+              <w:rPr>
+                <w:b w:val="false"/>
+                <w:bCs w:val="false"/>
+              </w:rPr>
+              <w:t xml:space="preserve">Vì sao không dùng thư viện auth có sẵn (OAuth, JWT lib)?</w:t>
+            </w:r>
+          </w:p>
+        </w:tc>
+        <w:tc>
+          <w:tcPr>
+            <w:tcW w:type="dxa" w:w="4900"/>
+          </w:tcPr>
+          <w:p>
+            <w:r>
+              <w:rPr>
+                <w:b w:val="false"/>
+                <w:bCs w:val="false"/>
+              </w:rPr>
+              <w:t xml:space="preserve">Yêu cầu chỉ cần một hệ thống đăng nhập nội bộ đơn giản, hai role cố định; PBKDF2 + HMAC từ thư viện chuẩn Python đủ an toàn cho quy mô này và không thêm dependency ngoài.</w:t>
             </w:r>
           </w:p>
         </w:tc>
@@ -2288,6 +2976,36 @@
                 <w:bCs w:val="false"/>
               </w:rPr>
               <w:t xml:space="preserve">https://your-domain/ có ổ khóa hợp lệ, /health/ready trả ready</w:t>
+            </w:r>
+          </w:p>
+        </w:tc>
+      </w:tr>
+      <w:tr>
+        <w:tc>
+          <w:tcPr>
+            <w:tcW w:type="dxa" w:w="500"/>
+          </w:tcPr>
+          <w:p>
+            <w:r>
+              <w:rPr>
+                <w:b w:val="false"/>
+                <w:bCs w:val="false"/>
+              </w:rPr>
+              <w:t xml:space="preserve">☐</w:t>
+            </w:r>
+          </w:p>
+        </w:tc>
+        <w:tc>
+          <w:tcPr>
+            <w:tcW w:type="dxa" w:w="8600"/>
+          </w:tcPr>
+          <w:p>
+            <w:r>
+              <w:rPr>
+                <w:b w:val="false"/>
+                <w:bCs w:val="false"/>
+              </w:rPr>
+              <w:t xml:space="preserve">Đăng nhập được bằng ADMIN_USERNAME/ADMIN_PASSWORD thật đã đặt trong .env trên VPS</w:t>
             </w:r>
           </w:p>
         </w:tc>

</xml_diff>